<commit_message>
Build 1530: delta lists sort by |net| as displayed; # bars to scale (common scale); county tier for school/state-house/state-senate lists; Arizona 2020 precincts (VEST, CC BY 4.0); '20 n/a rows; readable line rows; COVERAGE/spec/HANDOFF updated
</commit_message>
<xml_diff>
--- a/docs/us-districts-spec.docx
+++ b/docs/us-districts-spec.docx
@@ -5157,6 +5157,269 @@
               <w:rPr>
                 <w:sz w:val="18"/>
               </w:rPr>
+              <w:t>Delta sort rule</w:t>
+            </w:r>
+          </w:p>
+        </w:tc>
+        <w:tc>
+          <w:tcPr>
+            <w:tcW w:type="dxa" w:w="2880"/>
+          </w:tcPr>
+          <w:p>
+            <w:r>
+              <w:rPr>
+                <w:sz w:val="18"/>
+              </w:rPr>
+            </w:r>
+            <w:r>
+              <w:rPr>
+                <w:sz w:val="18"/>
+              </w:rPr>
+              <w:t xml:space="preserve">In delta mode the default sort is by the </w:t>
+            </w:r>
+            <w:r>
+              <w:rPr>
+                <w:b/>
+                <w:sz w:val="18"/>
+              </w:rPr>
+              <w:t>magnitude of the net change as displayed</w:t>
+            </w:r>
+            <w:r>
+              <w:rPr>
+                <w:sz w:val="18"/>
+              </w:rPr>
+              <w:t xml:space="preserve"> (largest first): % mode = change of the margin in points (</w:t>
+            </w:r>
+            <w:r>
+              <w:rPr>
+                <w:rFonts w:ascii="Consolas" w:hAnsi="Consolas"/>
+                <w:sz w:val="18"/>
+              </w:rPr>
+              <w:t>R +13.6</w:t>
+            </w:r>
+            <w:r>
+              <w:rPr>
+                <w:sz w:val="18"/>
+              </w:rPr>
+              <w:t>), # mode = change of the vote-count margin. Party side is ignored; the sort button reverses it. Applies at every list level (states, counties, towns, districts, precincts)</w:t>
+            </w:r>
+          </w:p>
+        </w:tc>
+        <w:tc>
+          <w:tcPr>
+            <w:tcW w:type="dxa" w:w="2880"/>
+          </w:tcPr>
+          <w:p>
+            <w:r>
+              <w:rPr>
+                <w:sz w:val="18"/>
+              </w:rPr>
+            </w:r>
+            <w:r>
+              <w:rPr>
+                <w:sz w:val="18"/>
+              </w:rPr>
+              <w:t>Yes (build 1530)</w:t>
+            </w:r>
+          </w:p>
+        </w:tc>
+      </w:tr>
+      <w:tr>
+        <w:tc>
+          <w:tcPr>
+            <w:tcW w:type="dxa" w:w="2880"/>
+          </w:tcPr>
+          <w:p>
+            <w:r>
+              <w:rPr>
+                <w:sz w:val="18"/>
+              </w:rPr>
+            </w:r>
+            <w:r>
+              <w:rPr>
+                <w:sz w:val="18"/>
+              </w:rPr>
+              <w:t>Single-year # bars</w:t>
+            </w:r>
+          </w:p>
+        </w:tc>
+        <w:tc>
+          <w:tcPr>
+            <w:tcW w:type="dxa" w:w="2880"/>
+          </w:tcPr>
+          <w:p>
+            <w:r>
+              <w:rPr>
+                <w:sz w:val="18"/>
+              </w:rPr>
+            </w:r>
+            <w:r>
+              <w:rPr>
+                <w:sz w:val="18"/>
+              </w:rPr>
+              <w:t>In # mode a bar's total length is proportional to the row's total votes on one common scale for the whole list (largest = longest, capped left of the floating buttons); the red/blue/gray split stays inside. % mode keeps full-width shares</w:t>
+            </w:r>
+          </w:p>
+        </w:tc>
+        <w:tc>
+          <w:tcPr>
+            <w:tcW w:type="dxa" w:w="2880"/>
+          </w:tcPr>
+          <w:p>
+            <w:r>
+              <w:rPr>
+                <w:sz w:val="18"/>
+              </w:rPr>
+            </w:r>
+            <w:r>
+              <w:rPr>
+                <w:sz w:val="18"/>
+              </w:rPr>
+              <w:t>Yes (build 1530)</w:t>
+            </w:r>
+          </w:p>
+        </w:tc>
+      </w:tr>
+      <w:tr>
+        <w:tc>
+          <w:tcPr>
+            <w:tcW w:type="dxa" w:w="2880"/>
+          </w:tcPr>
+          <w:p>
+            <w:r>
+              <w:rPr>
+                <w:sz w:val="18"/>
+              </w:rPr>
+            </w:r>
+            <w:r>
+              <w:rPr>
+                <w:sz w:val="18"/>
+              </w:rPr>
+              <w:t>District-type lists</w:t>
+            </w:r>
+          </w:p>
+        </w:tc>
+        <w:tc>
+          <w:tcPr>
+            <w:tcW w:type="dxa" w:w="2880"/>
+          </w:tcPr>
+          <w:p>
+            <w:r>
+              <w:rPr>
+                <w:sz w:val="18"/>
+              </w:rPr>
+            </w:r>
+            <w:r>
+              <w:rPr>
+                <w:sz w:val="18"/>
+              </w:rPr>
+              <w:t>US House: one nationwide list (435), a state's list is flat. School districts, state house and state senate: states -&gt; counties -&gt; districts. A district spanning counties is listed under each county it touches with its whole-district numbers and the ≈ mark (identical to the map pop-up)</w:t>
+            </w:r>
+          </w:p>
+        </w:tc>
+        <w:tc>
+          <w:tcPr>
+            <w:tcW w:type="dxa" w:w="2880"/>
+          </w:tcPr>
+          <w:p>
+            <w:r>
+              <w:rPr>
+                <w:sz w:val="18"/>
+              </w:rPr>
+            </w:r>
+            <w:r>
+              <w:rPr>
+                <w:sz w:val="18"/>
+              </w:rPr>
+              <w:t>Yes (build 1530)</w:t>
+            </w:r>
+          </w:p>
+        </w:tc>
+      </w:tr>
+      <w:tr>
+        <w:tc>
+          <w:tcPr>
+            <w:tcW w:type="dxa" w:w="2880"/>
+          </w:tcPr>
+          <w:p>
+            <w:r>
+              <w:rPr>
+                <w:sz w:val="18"/>
+              </w:rPr>
+            </w:r>
+            <w:r>
+              <w:rPr>
+                <w:sz w:val="18"/>
+              </w:rPr>
+              <w:t>Rows without a 2020 side</w:t>
+            </w:r>
+          </w:p>
+        </w:tc>
+        <w:tc>
+          <w:tcPr>
+            <w:tcW w:type="dxa" w:w="2880"/>
+          </w:tcPr>
+          <w:p>
+            <w:r>
+              <w:rPr>
+                <w:sz w:val="18"/>
+              </w:rPr>
+            </w:r>
+            <w:r>
+              <w:rPr>
+                <w:sz w:val="18"/>
+              </w:rPr>
+              <w:t xml:space="preserve">Show the real 2024 value with </w:t>
+            </w:r>
+            <w:r>
+              <w:rPr>
+                <w:rFonts w:ascii="Consolas" w:hAnsi="Consolas"/>
+                <w:sz w:val="18"/>
+              </w:rPr>
+              <w:t>'20 n/a</w:t>
+            </w:r>
+            <w:r>
+              <w:rPr>
+                <w:sz w:val="18"/>
+              </w:rPr>
+              <w:t>, never an empty "no data" row</w:t>
+            </w:r>
+          </w:p>
+        </w:tc>
+        <w:tc>
+          <w:tcPr>
+            <w:tcW w:type="dxa" w:w="2880"/>
+          </w:tcPr>
+          <w:p>
+            <w:r>
+              <w:rPr>
+                <w:sz w:val="18"/>
+              </w:rPr>
+            </w:r>
+            <w:r>
+              <w:rPr>
+                <w:sz w:val="18"/>
+              </w:rPr>
+              <w:t>Yes (build 1530)</w:t>
+            </w:r>
+          </w:p>
+        </w:tc>
+      </w:tr>
+      <w:tr>
+        <w:tc>
+          <w:tcPr>
+            <w:tcW w:type="dxa" w:w="2880"/>
+          </w:tcPr>
+          <w:p>
+            <w:r>
+              <w:rPr>
+                <w:sz w:val="18"/>
+              </w:rPr>
+            </w:r>
+            <w:r>
+              <w:rPr>
+                <w:sz w:val="18"/>
+              </w:rPr>
               <w:t>List-all rows</w:t>
             </w:r>
           </w:p>
@@ -10170,6 +10433,57 @@
                 <w:sz w:val="18"/>
               </w:rPr>
               <w:t>Change</w:t>
+            </w:r>
+          </w:p>
+        </w:tc>
+      </w:tr>
+      <w:tr>
+        <w:tc>
+          <w:tcPr>
+            <w:tcW w:type="dxa" w:w="4320"/>
+          </w:tcPr>
+          <w:p>
+            <w:r>
+              <w:rPr>
+                <w:sz w:val="18"/>
+              </w:rPr>
+            </w:r>
+            <w:r>
+              <w:rPr>
+                <w:sz w:val="18"/>
+              </w:rPr>
+              <w:t>Oct 15, 2026</w:t>
+            </w:r>
+          </w:p>
+        </w:tc>
+        <w:tc>
+          <w:tcPr>
+            <w:tcW w:type="dxa" w:w="4320"/>
+          </w:tcPr>
+          <w:p>
+            <w:r>
+              <w:rPr>
+                <w:sz w:val="18"/>
+              </w:rPr>
+            </w:r>
+            <w:r>
+              <w:rPr>
+                <w:sz w:val="18"/>
+              </w:rPr>
+              <w:t xml:space="preserve">Build 1530: delta sort by net magnitude; # bars to scale; county tier for school/state-house/state-senate lists; Arizona 2020 precincts (VEST, CC BY 4.0); </w:t>
+            </w:r>
+            <w:r>
+              <w:rPr>
+                <w:rFonts w:ascii="Consolas" w:hAnsi="Consolas"/>
+                <w:sz w:val="18"/>
+              </w:rPr>
+              <w:t>'20 n/a</w:t>
+            </w:r>
+            <w:r>
+              <w:rPr>
+                <w:sz w:val="18"/>
+              </w:rPr>
+              <w:t xml:space="preserve"> rows; readable line rows (1529)</w:t>
             </w:r>
           </w:p>
         </w:tc>

</xml_diff>

<commit_message>
Build 1531: 2020 precinct coverage completed for 40 states from VEST 2020 (CC BY 4.0, QC vs official county totals, tools/build_vest2020.py); list-all-modes delta checks refreshed; COVERAGE/spec/HANDOFF updated
</commit_message>
<xml_diff>
--- a/docs/us-districts-spec.docx
+++ b/docs/us-districts-spec.docx
@@ -10433,6 +10433,44 @@
                 <w:sz w:val="18"/>
               </w:rPr>
               <w:t>Change</w:t>
+            </w:r>
+          </w:p>
+        </w:tc>
+      </w:tr>
+      <w:tr>
+        <w:tc>
+          <w:tcPr>
+            <w:tcW w:type="dxa" w:w="4320"/>
+          </w:tcPr>
+          <w:p>
+            <w:r>
+              <w:rPr>
+                <w:sz w:val="18"/>
+              </w:rPr>
+            </w:r>
+            <w:r>
+              <w:rPr>
+                <w:sz w:val="18"/>
+              </w:rPr>
+              <w:t>Oct 15, 2026</w:t>
+            </w:r>
+          </w:p>
+        </w:tc>
+        <w:tc>
+          <w:tcPr>
+            <w:tcW w:type="dxa" w:w="4320"/>
+          </w:tcPr>
+          <w:p>
+            <w:r>
+              <w:rPr>
+                <w:sz w:val="18"/>
+              </w:rPr>
+            </w:r>
+            <w:r>
+              <w:rPr>
+                <w:sz w:val="18"/>
+              </w:rPr>
+              <w:t>Build 1531: 2020 precinct coverage completed for 40 states from VEST 2020 (CC BY 4.0), QC against official county totals; remaining gaps in COVERAGE.md</w:t>
             </w:r>
           </w:p>
         </w:tc>

</xml_diff>

<commit_message>
Build 1535: Arkansas SD 006 from official precinct returns + AR GIS precinct/Senate boundaries (tools/fix_ar2024_sd6.py, e24, 4.6 % apportioned) so all 1,942 senate districts have 2024 results; Franklin, Greene, Saline, Sevier, Stone counties (AR) rebuilt from MEDSL official returns + AR GIS precinct shapes (new tools/fix_county2024.py); x20 Arkansas rebuilt; 2 gray AR schools filled (fill_gray.py --redo-exact-min); COVERAGE/spec/HANDOFF updated
</commit_message>
<xml_diff>
--- a/docs/us-districts-spec.docx
+++ b/docs/us-districts-spec.docx
@@ -4573,7 +4573,7 @@
         <w:pStyle w:val="Heading2"/>
       </w:pPr>
       <w:r>
-        <w:t>9.2 Coverage (computed from the data files on Oct 17, 2026, build 1534)</w:t>
+        <w:t>9.2 Coverage (computed from the data files on Oct 17, 2026, build 1535)</w:t>
       </w:r>
     </w:p>
     <w:tbl>
@@ -4736,7 +4736,7 @@
           </w:tcPr>
           <w:p>
             <w:r>
-              <w:t>1,941 (99.9%)</w:t>
+              <w:t>1,942 (100%)</w:t>
             </w:r>
           </w:p>
         </w:tc>
@@ -4756,7 +4756,7 @@
           </w:tcPr>
           <w:p>
             <w:r>
-              <w:t>570</w:t>
+              <w:t>571</w:t>
             </w:r>
           </w:p>
         </w:tc>
@@ -4840,7 +4840,7 @@
           </w:tcPr>
           <w:p>
             <w:r>
-              <w:t>13,118 (99.3%)</w:t>
+              <w:t>13,120 (99.3%)</w:t>
             </w:r>
           </w:p>
         </w:tc>
@@ -4860,7 +4860,7 @@
           </w:tcPr>
           <w:p>
             <w:r>
-              <w:t>4,933</w:t>
+              <w:t>4,939</w:t>
             </w:r>
           </w:p>
         </w:tc>
@@ -6603,7 +6603,7 @@
           </w:tcPr>
           <w:p>
             <w:r>
-              <w:t>2024 gray legislative districts down to 7 (AR SD 006; WY 054, MO 156, LA 057, MS 115, VA 089, AL 004); 90 gray school districts (SD 26, ME 14 …); reasons in COVERAGE.md</w:t>
+              <w:t>2024 gray legislative districts down to 6 (state house WY 054, MO 156, LA 057, MS 115, VA 089, AL 004; every senate district has results since 1535); 88 gray school districts (SD 26, ME 14 …); reasons in COVERAGE.md</w:t>
             </w:r>
           </w:p>
         </w:tc>
@@ -6613,7 +6613,7 @@
           </w:tcPr>
           <w:p>
             <w:r>
-              <w:t>Partly done (1534)</w:t>
+              <w:t>Partly done (1535)</w:t>
             </w:r>
           </w:p>
         </w:tc>
@@ -7317,6 +7317,37 @@
                 <w:b/>
               </w:rPr>
               <w:t>Change</w:t>
+            </w:r>
+          </w:p>
+        </w:tc>
+      </w:tr>
+      <w:tr>
+        <w:tc>
+          <w:tcPr>
+            <w:tcW w:type="dxa" w:w="4968"/>
+          </w:tcPr>
+          <w:p>
+            <w:r>
+              <w:t>Oct 17, 2026</w:t>
+            </w:r>
+          </w:p>
+        </w:tc>
+        <w:tc>
+          <w:tcPr>
+            <w:tcW w:type="dxa" w:w="4968"/>
+          </w:tcPr>
+          <w:p>
+            <w:r>
+              <w:t>Build 1535: Arkansas SD 006 from official returns + Arkansas GIS precinct and Senate boundaries (≈, 4.6 % apportioned); Franklin, Greene, Saline, Sevier and Stone counties (AR) rebuilt from official returns and state precinct shapes (</w:t>
+            </w:r>
+            <w:r>
+              <w:rPr>
+                <w:rFonts w:ascii="Consolas" w:hAnsi="Consolas"/>
+              </w:rPr>
+              <w:t>tools/fix_county2024.py</w:t>
+            </w:r>
+            <w:r>
+              <w:t>); 2 gray AR schools filled; all 1,942 state senate districts now have 2024 results</w:t>
             </w:r>
           </w:p>
         </w:tc>

</xml_diff>

<commit_message>
Build 1539: Hawaii Department of Education 2024 = official statewide total (exact); COVERAGE.md (coverage per layer/year, exact vs ≈, final gray inventory with reasons), HANDOFF.md and spec (9.2, open items, changelog, .docx) updated for builds 1536-1539
</commit_message>
<xml_diff>
--- a/docs/us-districts-spec.docx
+++ b/docs/us-districts-spec.docx
@@ -4573,7 +4573,7 @@
         <w:pStyle w:val="Heading2"/>
       </w:pPr>
       <w:r>
-        <w:t>9.2 Coverage (computed from the data files on Oct 17, 2026, build 1535)</w:t>
+        <w:t>9.2 Coverage (computed from the data files on Oct 17, 2026, build 1539)</w:t>
       </w:r>
     </w:p>
     <w:tbl>
@@ -4584,16 +4584,15 @@
         <w:tblLook w:firstColumn="1" w:firstRow="1" w:lastColumn="0" w:lastRow="0" w:noHBand="0" w:noVBand="1" w:val="04A0"/>
       </w:tblPr>
       <w:tblGrid>
-        <w:gridCol w:w="1987"/>
-        <w:gridCol w:w="1987"/>
-        <w:gridCol w:w="1987"/>
-        <w:gridCol w:w="1987"/>
-        <w:gridCol w:w="1987"/>
+        <w:gridCol w:w="2484"/>
+        <w:gridCol w:w="2484"/>
+        <w:gridCol w:w="2484"/>
+        <w:gridCol w:w="2484"/>
       </w:tblGrid>
       <w:tr>
         <w:tc>
           <w:tcPr>
-            <w:tcW w:type="dxa" w:w="1987"/>
+            <w:tcW w:type="dxa" w:w="2484"/>
           </w:tcPr>
           <w:p>
             <w:r>
@@ -4606,7 +4605,7 @@
         </w:tc>
         <w:tc>
           <w:tcPr>
-            <w:tcW w:type="dxa" w:w="1987"/>
+            <w:tcW w:type="dxa" w:w="2484"/>
           </w:tcPr>
           <w:p>
             <w:r>
@@ -4619,40 +4618,27 @@
         </w:tc>
         <w:tc>
           <w:tcPr>
-            <w:tcW w:type="dxa" w:w="1987"/>
+            <w:tcW w:type="dxa" w:w="2484"/>
           </w:tcPr>
           <w:p>
             <w:r>
               <w:rPr>
                 <w:b/>
               </w:rPr>
-              <w:t>2024 with results</w:t>
-            </w:r>
-          </w:p>
-        </w:tc>
-        <w:tc>
-          <w:tcPr>
-            <w:tcW w:type="dxa" w:w="1987"/>
+              <w:t>2024 with results (exact / ≈)</w:t>
+            </w:r>
+          </w:p>
+        </w:tc>
+        <w:tc>
+          <w:tcPr>
+            <w:tcW w:type="dxa" w:w="2484"/>
           </w:tcPr>
           <w:p>
             <w:r>
               <w:rPr>
                 <w:b/>
               </w:rPr>
-              <w:t>2020 with results</w:t>
-            </w:r>
-          </w:p>
-        </w:tc>
-        <w:tc>
-          <w:tcPr>
-            <w:tcW w:type="dxa" w:w="1987"/>
-          </w:tcPr>
-          <w:p>
-            <w:r>
-              <w:rPr>
-                <w:b/>
-              </w:rPr>
-              <w:t>Rows flagged estimate</w:t>
+              <w:t>2020 with results (exact / ≈)</w:t>
             </w:r>
           </w:p>
         </w:tc>
@@ -4660,7 +4646,7 @@
       <w:tr>
         <w:tc>
           <w:tcPr>
-            <w:tcW w:type="dxa" w:w="1987"/>
+            <w:tcW w:type="dxa" w:w="2484"/>
           </w:tcPr>
           <w:p>
             <w:r>
@@ -4670,7 +4656,7 @@
         </w:tc>
         <w:tc>
           <w:tcPr>
-            <w:tcW w:type="dxa" w:w="1987"/>
+            <w:tcW w:type="dxa" w:w="2484"/>
           </w:tcPr>
           <w:p>
             <w:r>
@@ -4680,31 +4666,21 @@
         </w:tc>
         <w:tc>
           <w:tcPr>
-            <w:tcW w:type="dxa" w:w="1987"/>
-          </w:tcPr>
-          <w:p>
-            <w:r>
-              <w:t>435 (100%)</w:t>
-            </w:r>
-          </w:p>
-        </w:tc>
-        <w:tc>
-          <w:tcPr>
-            <w:tcW w:type="dxa" w:w="1987"/>
-          </w:tcPr>
-          <w:p>
-            <w:r>
-              <w:t>435 (100%)</w:t>
-            </w:r>
-          </w:p>
-        </w:tc>
-        <w:tc>
-          <w:tcPr>
-            <w:tcW w:type="dxa" w:w="1987"/>
-          </w:tcPr>
-          <w:p>
-            <w:r>
-              <w:t>73</w:t>
+            <w:tcW w:type="dxa" w:w="2484"/>
+          </w:tcPr>
+          <w:p>
+            <w:r>
+              <w:t>435 (362 / 73)</w:t>
+            </w:r>
+          </w:p>
+        </w:tc>
+        <w:tc>
+          <w:tcPr>
+            <w:tcW w:type="dxa" w:w="2484"/>
+          </w:tcPr>
+          <w:p>
+            <w:r>
+              <w:t>435 (362 / 73)</w:t>
             </w:r>
           </w:p>
         </w:tc>
@@ -4712,7 +4688,7 @@
       <w:tr>
         <w:tc>
           <w:tcPr>
-            <w:tcW w:type="dxa" w:w="1987"/>
+            <w:tcW w:type="dxa" w:w="2484"/>
           </w:tcPr>
           <w:p>
             <w:r>
@@ -4722,7 +4698,7 @@
         </w:tc>
         <w:tc>
           <w:tcPr>
-            <w:tcW w:type="dxa" w:w="1987"/>
+            <w:tcW w:type="dxa" w:w="2484"/>
           </w:tcPr>
           <w:p>
             <w:r>
@@ -4732,31 +4708,21 @@
         </w:tc>
         <w:tc>
           <w:tcPr>
-            <w:tcW w:type="dxa" w:w="1987"/>
-          </w:tcPr>
-          <w:p>
-            <w:r>
-              <w:t>1,942 (100%)</w:t>
-            </w:r>
-          </w:p>
-        </w:tc>
-        <w:tc>
-          <w:tcPr>
-            <w:tcW w:type="dxa" w:w="1987"/>
-          </w:tcPr>
-          <w:p>
-            <w:r>
-              <w:t>1,942 (100%)</w:t>
-            </w:r>
-          </w:p>
-        </w:tc>
-        <w:tc>
-          <w:tcPr>
-            <w:tcW w:type="dxa" w:w="1987"/>
-          </w:tcPr>
-          <w:p>
-            <w:r>
-              <w:t>571</w:t>
+            <w:tcW w:type="dxa" w:w="2484"/>
+          </w:tcPr>
+          <w:p>
+            <w:r>
+              <w:t>1,942 (1,403 / 539)</w:t>
+            </w:r>
+          </w:p>
+        </w:tc>
+        <w:tc>
+          <w:tcPr>
+            <w:tcW w:type="dxa" w:w="2484"/>
+          </w:tcPr>
+          <w:p>
+            <w:r>
+              <w:t>1,942 (1,401 / 541)</w:t>
             </w:r>
           </w:p>
         </w:tc>
@@ -4764,7 +4730,7 @@
       <w:tr>
         <w:tc>
           <w:tcPr>
-            <w:tcW w:type="dxa" w:w="1987"/>
+            <w:tcW w:type="dxa" w:w="2484"/>
           </w:tcPr>
           <w:p>
             <w:r>
@@ -4774,7 +4740,7 @@
         </w:tc>
         <w:tc>
           <w:tcPr>
-            <w:tcW w:type="dxa" w:w="1987"/>
+            <w:tcW w:type="dxa" w:w="2484"/>
           </w:tcPr>
           <w:p>
             <w:r>
@@ -4784,31 +4750,21 @@
         </w:tc>
         <w:tc>
           <w:tcPr>
-            <w:tcW w:type="dxa" w:w="1987"/>
-          </w:tcPr>
-          <w:p>
-            <w:r>
-              <w:t>4,876 (99.9%)</w:t>
-            </w:r>
-          </w:p>
-        </w:tc>
-        <w:tc>
-          <w:tcPr>
-            <w:tcW w:type="dxa" w:w="1987"/>
-          </w:tcPr>
-          <w:p>
-            <w:r>
-              <w:t>4,882 (100%)</w:t>
-            </w:r>
-          </w:p>
-        </w:tc>
-        <w:tc>
-          <w:tcPr>
-            <w:tcW w:type="dxa" w:w="1987"/>
-          </w:tcPr>
-          <w:p>
-            <w:r>
-              <w:t>1,349</w:t>
+            <w:tcW w:type="dxa" w:w="2484"/>
+          </w:tcPr>
+          <w:p>
+            <w:r>
+              <w:t>4,877 (3,636 / 1,241)</w:t>
+            </w:r>
+          </w:p>
+        </w:tc>
+        <w:tc>
+          <w:tcPr>
+            <w:tcW w:type="dxa" w:w="2484"/>
+          </w:tcPr>
+          <w:p>
+            <w:r>
+              <w:t>4,882 (3,586 / 1,296)</w:t>
             </w:r>
           </w:p>
         </w:tc>
@@ -4816,7 +4772,7 @@
       <w:tr>
         <w:tc>
           <w:tcPr>
-            <w:tcW w:type="dxa" w:w="1987"/>
+            <w:tcW w:type="dxa" w:w="2484"/>
           </w:tcPr>
           <w:p>
             <w:r>
@@ -4826,7 +4782,7 @@
         </w:tc>
         <w:tc>
           <w:tcPr>
-            <w:tcW w:type="dxa" w:w="1987"/>
+            <w:tcW w:type="dxa" w:w="2484"/>
           </w:tcPr>
           <w:p>
             <w:r>
@@ -4836,31 +4792,21 @@
         </w:tc>
         <w:tc>
           <w:tcPr>
-            <w:tcW w:type="dxa" w:w="1987"/>
-          </w:tcPr>
-          <w:p>
-            <w:r>
-              <w:t>13,120 (99.3%)</w:t>
-            </w:r>
-          </w:p>
-        </w:tc>
-        <w:tc>
-          <w:tcPr>
-            <w:tcW w:type="dxa" w:w="1987"/>
-          </w:tcPr>
-          <w:p>
-            <w:r>
-              <w:t>13,182 (99.8%)</w:t>
-            </w:r>
-          </w:p>
-        </w:tc>
-        <w:tc>
-          <w:tcPr>
-            <w:tcW w:type="dxa" w:w="1987"/>
-          </w:tcPr>
-          <w:p>
-            <w:r>
-              <w:t>4,939</w:t>
+            <w:tcW w:type="dxa" w:w="2484"/>
+          </w:tcPr>
+          <w:p>
+            <w:r>
+              <w:t>13,124 (8,245 / 4,879)</w:t>
+            </w:r>
+          </w:p>
+        </w:tc>
+        <w:tc>
+          <w:tcPr>
+            <w:tcW w:type="dxa" w:w="2484"/>
+          </w:tcPr>
+          <w:p>
+            <w:r>
+              <w:t>13,182 (8,387 / 4,795)</w:t>
             </w:r>
           </w:p>
         </w:tc>
@@ -6603,7 +6549,7 @@
           </w:tcPr>
           <w:p>
             <w:r>
-              <w:t>2024 gray legislative districts down to 6 (state house WY 054, MO 156, LA 057, MS 115, VA 089, AL 004; every senate district has results since 1535); 88 gray school districts (SD 26, ME 14 …); reasons in COVERAGE.md</w:t>
+              <w:t>2024 gray legislative districts down to 5 (state house AL 004, LA 057, MS 115, VA 089, WY 054); 84 gray school districts in 2024 (SD 26, ME 14, VT 8, MO 8 …) and 26 in 2020; reasons per item in COVERAGE.md (need official precinct shapes, or structurally impossible: vote centers, combined unorganized territories, uninhabited gores)</w:t>
             </w:r>
           </w:p>
         </w:tc>
@@ -6613,7 +6559,7 @@
           </w:tcPr>
           <w:p>
             <w:r>
-              <w:t>Partly done (1535)</w:t>
+              <w:t>Partly done (1539)</w:t>
             </w:r>
           </w:p>
         </w:tc>
@@ -7317,6 +7263,28 @@
                 <w:b/>
               </w:rPr>
               <w:t>Change</w:t>
+            </w:r>
+          </w:p>
+        </w:tc>
+      </w:tr>
+      <w:tr>
+        <w:tc>
+          <w:tcPr>
+            <w:tcW w:type="dxa" w:w="4968"/>
+          </w:tcPr>
+          <w:p>
+            <w:r>
+              <w:t>Oct 17, 2026</w:t>
+            </w:r>
+          </w:p>
+        </w:tc>
+        <w:tc>
+          <w:tcPr>
+            <w:tcW w:type="dxa" w:w="4968"/>
+          </w:tcPr>
+          <w:p>
+            <w:r>
+              <w:t>Builds 1536-1539: 2024 precincts from official returns for 31 more counties (GA, SD, TN, VA in 1536; AL, CO, GA, MA, MI, MO, NE, SD, TN, VT in 1537) on 2020 boundaries of unchanged precincts, Census VTDs/towns or the TN Comptroller layer; Vermont school districts as exact sums of official town returns; MO HD 156 ≈; Hawaii DOE = statewide total; back button restyled as a thin Instagram-style chevron aligned with the icon column and the chart/clock button (1538)</w:t>
             </w:r>
           </w:p>
         </w:tc>

</xml_diff>

<commit_message>
Docs: COVERAGE, HANDOFF, spec (+docx) for builds 1540-1541
</commit_message>
<xml_diff>
--- a/docs/us-districts-spec.docx
+++ b/docs/us-districts-spec.docx
@@ -7284,6 +7284,28 @@
           </w:tcPr>
           <w:p>
             <w:r>
+              <w:t>Builds 1540-1541: Alaska boroughs shown in 2020 and change mode (≈ 2020 borough results merged into the 2020 county table); national total counts Alaska once (2024 had counted it twice); back chevron in the open menu centred on the first menu row.</w:t>
+            </w:r>
+          </w:p>
+        </w:tc>
+      </w:tr>
+      <w:tr>
+        <w:tc>
+          <w:tcPr>
+            <w:tcW w:type="dxa" w:w="4968"/>
+          </w:tcPr>
+          <w:p>
+            <w:r>
+              <w:t>Oct 17, 2026</w:t>
+            </w:r>
+          </w:p>
+        </w:tc>
+        <w:tc>
+          <w:tcPr>
+            <w:tcW w:type="dxa" w:w="4968"/>
+          </w:tcPr>
+          <w:p>
+            <w:r>
               <w:t>Builds 1536-1539: 2024 precincts from official returns for 31 more counties (GA, SD, TN, VA in 1536; AL, CO, GA, MA, MI, MO, NE, SD, TN, VT in 1537) on 2020 boundaries of unchanged precincts, Census VTDs/towns or the TN Comptroller layer; Vermont school districts as exact sums of official town returns; MO HD 156 ≈; Hawaii DOE = statewide total; back button restyled as a thin Instagram-style chevron aligned with the icon column and the chart/clock button (1538)</w:t>
             </w:r>
           </w:p>

</xml_diff>

<commit_message>
Docs: builds 1545-1548 in COVERAGE, HANDOFF, spec
</commit_message>
<xml_diff>
--- a/docs/us-districts-spec.docx
+++ b/docs/us-districts-spec.docx
@@ -7284,6 +7284,28 @@
           </w:tcPr>
           <w:p>
             <w:r>
+              <w:t>Builds 1545-1548: list-view back chevron and sort glyph matched in size, level, raised into the band above the list, chevron half-way to the left edge; list charts use a left-edge candidate column (ranked, toggles, rank badge for photo-less answers) instead of per-row photos, # bars to a common scale, sort follows selected candidates; address search with Census one-line, Census components and Nominatim fallbacks, ZIP row, universal-search address rows, typed results nationwide.</w:t>
+            </w:r>
+          </w:p>
+        </w:tc>
+      </w:tr>
+      <w:tr>
+        <w:tc>
+          <w:tcPr>
+            <w:tcW w:type="dxa" w:w="4968"/>
+          </w:tcPr>
+          <w:p>
+            <w:r>
+              <w:t>Oct 17, 2026</w:t>
+            </w:r>
+          </w:p>
+        </w:tc>
+        <w:tc>
+          <w:tcPr>
+            <w:tcW w:type="dxa" w:w="4968"/>
+          </w:tcPr>
+          <w:p>
+            <w:r>
               <w:t>Builds 1540-1544: Alaska boroughs shown in 2020 and change mode (≈ 2020 borough results merged into the 2020 county table); national total counts Alaska once (2024 had counted it twice); back chevron in the open menu centred on the first menu row; DC row in the states list keeps the map on DC; 'List all …' row hidden from the first search keystroke; change-mode pop-ups keep the ≈ estimate line.</w:t>
             </w:r>
           </w:p>

</xml_diff>